<commit_message>
Atualiza roteiros da Semana 2
</commit_message>
<xml_diff>
--- a/MATERIAL_2027/C2/S2/DADOS3EMC2B1S2A3_AP3_aluno.docx
+++ b/MATERIAL_2027/C2/S2/DADOS3EMC2B1S2A3_AP3_aluno.docx
@@ -1,6 +1,6 @@
 
 <file path=word/document.xml><?xml version="1.0" encoding="utf-8"?>
-<w:document xmlns:wpc="http://schemas.microsoft.com/office/word/2010/wordprocessingCanvas" xmlns:cx="http://schemas.microsoft.com/office/drawing/2014/chartex" xmlns:cx1="http://schemas.microsoft.com/office/drawing/2015/9/8/chartex" xmlns:cx2="http://schemas.microsoft.com/office/drawing/2015/10/21/chartex" xmlns:cx3="http://schemas.microsoft.com/office/drawing/2016/5/9/chartex" xmlns:cx4="http://schemas.microsoft.com/office/drawing/2016/5/10/chartex" xmlns:cx5="http://schemas.microsoft.com/office/drawing/2016/5/11/chartex" xmlns:cx6="http://schemas.microsoft.com/office/drawing/2016/5/12/chartex" xmlns:cx7="http://schemas.microsoft.com/office/drawing/2016/5/13/chartex" xmlns:cx8="http://schemas.microsoft.com/office/drawing/2016/5/14/chartex" xmlns:mc="http://schemas.openxmlformats.org/markup-compatibility/2006" xmlns:aink="http://schemas.microsoft.com/office/drawing/2016/ink" xmlns:am3d="http://schemas.microsoft.com/office/drawing/2017/model3d" xmlns:o="urn:schemas-microsoft-com:office:office" xmlns:oel="http://schemas.microsoft.com/office/2019/extlst" xmlns:r="http://schemas.openxmlformats.org/officeDocument/2006/relationships" xmlns:m="http://schemas.openxmlformats.org/officeDocument/2006/math" xmlns:v="urn:schemas-microsoft-com:vml" xmlns:wp14="http://schemas.microsoft.com/office/word/2010/wordprocessingDrawing" xmlns:wp="http://schemas.openxmlformats.org/drawingml/2006/wordprocessingDrawing" xmlns:w10="urn:schemas-microsoft-com:office:word" xmlns:w="http://schemas.openxmlformats.org/wordprocessingml/2006/main" xmlns:w14="http://schemas.microsoft.com/office/word/2010/wordml" xmlns:w15="http://schemas.microsoft.com/office/word/2012/wordml" xmlns:w16cei="http://schemas.microsoft.com/office/word/2026/wordml/cei" xmlns:w16cex="http://schemas.microsoft.com/office/word/2018/wordml/cex" xmlns:w16cid="http://schemas.microsoft.com/office/word/2016/wordml/cid" xmlns:w16="http://schemas.microsoft.com/office/word/2018/wordml" xmlns:w16du="http://schemas.microsoft.com/office/word/2023/wordml/word16du" xmlns:w16sdtdh="http://schemas.microsoft.com/office/word/2020/wordml/sdtdatahash" xmlns:w16sdtfl="http://schemas.microsoft.com/office/word/2024/wordml/sdtformatlock" xmlns:w16se="http://schemas.microsoft.com/office/word/2015/wordml/symex" xmlns:wpg="http://schemas.microsoft.com/office/word/2010/wordprocessingGroup" xmlns:wpi="http://schemas.microsoft.com/office/word/2010/wordprocessingInk" xmlns:wne="http://schemas.microsoft.com/office/word/2006/wordml" xmlns:wps="http://schemas.microsoft.com/office/word/2010/wordprocessingShape" mc:Ignorable="w14 w15 w16se w16cid w16 w16cex w16sdtdh w16sdtfl w16du wp14">
+<w:document xmlns:wpc="http://schemas.microsoft.com/office/word/2010/wordprocessingCanvas" xmlns:cx="http://schemas.microsoft.com/office/drawing/2014/chartex" xmlns:cx1="http://schemas.microsoft.com/office/drawing/2015/9/8/chartex" xmlns:cx2="http://schemas.microsoft.com/office/drawing/2015/10/21/chartex" xmlns:cx3="http://schemas.microsoft.com/office/drawing/2016/5/9/chartex" xmlns:cx4="http://schemas.microsoft.com/office/drawing/2016/5/10/chartex" xmlns:cx5="http://schemas.microsoft.com/office/drawing/2016/5/11/chartex" xmlns:cx6="http://schemas.microsoft.com/office/drawing/2016/5/12/chartex" xmlns:cx7="http://schemas.microsoft.com/office/drawing/2016/5/13/chartex" xmlns:cx8="http://schemas.microsoft.com/office/drawing/2016/5/14/chartex" xmlns:mc="http://schemas.openxmlformats.org/markup-compatibility/2006" xmlns:aink="http://schemas.microsoft.com/office/drawing/2016/ink" xmlns:am3d="http://schemas.microsoft.com/office/drawing/2017/model3d" xmlns:o="urn:schemas-microsoft-com:office:office" xmlns:oel="http://schemas.microsoft.com/office/2019/extlst" xmlns:r="http://schemas.openxmlformats.org/officeDocument/2006/relationships" xmlns:m="http://schemas.openxmlformats.org/officeDocument/2006/math" xmlns:v="urn:schemas-microsoft-com:vml" xmlns:wp14="http://schemas.microsoft.com/office/word/2010/wordprocessingDrawing" xmlns:wp="http://schemas.openxmlformats.org/drawingml/2006/wordprocessingDrawing" xmlns:w10="urn:schemas-microsoft-com:office:word" xmlns:w="http://schemas.openxmlformats.org/wordprocessingml/2006/main" xmlns:w14="http://schemas.microsoft.com/office/word/2010/wordml" xmlns:w15="http://schemas.microsoft.com/office/word/2012/wordml" xmlns:w16cex="http://schemas.microsoft.com/office/word/2018/wordml/cex" xmlns:w16cid="http://schemas.microsoft.com/office/word/2016/wordml/cid" xmlns:w16="http://schemas.microsoft.com/office/word/2018/wordml" xmlns:w16du="http://schemas.microsoft.com/office/word/2023/wordml/word16du" xmlns:w16sdtdh="http://schemas.microsoft.com/office/word/2020/wordml/sdtdatahash" xmlns:w16sdtfl="http://schemas.microsoft.com/office/word/2024/wordml/sdtformatlock" xmlns:w16se="http://schemas.microsoft.com/office/word/2015/wordml/symex" xmlns:wpg="http://schemas.microsoft.com/office/word/2010/wordprocessingGroup" xmlns:wpi="http://schemas.microsoft.com/office/word/2010/wordprocessingInk" xmlns:wne="http://schemas.microsoft.com/office/word/2006/wordml" xmlns:wps="http://schemas.microsoft.com/office/word/2010/wordprocessingShape" mc:Ignorable="w14 w15 w16se w16cid w16 w16cex w16sdtdh w16sdtfl w16du wp14">
   <w:body>
     <w:p>
       <w:pPr>
@@ -140,25 +140,30 @@
       <w:pPr>
         <w:pStyle w:val="Commarcadores"/>
         <w:spacing w:after="20"/>
-      </w:pPr>
-      <w:r>
+        <w:rPr>
+          <w:lang w:val="pt-BR"/>
+        </w:rPr>
+      </w:pPr>
+      <w:r>
+        <w:rPr>
+          <w:lang w:val="pt-BR"/>
+        </w:rPr>
         <w:t>Notebook da atividade prática  fornecido pelo professor, por meio do link:</w:t>
       </w:r>
     </w:p>
     <w:p>
       <w:pPr>
         <w:pStyle w:val="Commarcadores"/>
-        <w:numPr>
-          <w:ilvl w:val="0"/>
-          <w:numId w:val="0"/>
-        </w:numPr>
         <w:spacing w:after="20"/>
-        <w:ind w:left="360"/>
+        <w:rPr>
+          <w:lang w:val="pt-BR"/>
+        </w:rPr>
       </w:pPr>
       <w:hyperlink r:id="rId8" w:history="1">
         <w:r>
           <w:rPr>
             <w:rStyle w:val="Hyperlink"/>
+            <w:lang w:val="pt-BR"/>
           </w:rPr>
           <w:t>https://github.com/ept-seduc-sp/dados-ano2/blob/main/MATERIAL_2027/C2/S2/DADOS3EMC2B1S2A3_AP3_aluno.ipynb</w:t>
         </w:r>
@@ -2065,7 +2070,7 @@
 </file>
 
 <file path=word/comments.xml><?xml version="1.0" encoding="utf-8"?>
-<w:comments xmlns:wpc="http://schemas.microsoft.com/office/word/2010/wordprocessingCanvas" xmlns:cx="http://schemas.microsoft.com/office/drawing/2014/chartex" xmlns:cx1="http://schemas.microsoft.com/office/drawing/2015/9/8/chartex" xmlns:cx2="http://schemas.microsoft.com/office/drawing/2015/10/21/chartex" xmlns:cx3="http://schemas.microsoft.com/office/drawing/2016/5/9/chartex" xmlns:cx4="http://schemas.microsoft.com/office/drawing/2016/5/10/chartex" xmlns:cx5="http://schemas.microsoft.com/office/drawing/2016/5/11/chartex" xmlns:cx6="http://schemas.microsoft.com/office/drawing/2016/5/12/chartex" xmlns:cx7="http://schemas.microsoft.com/office/drawing/2016/5/13/chartex" xmlns:cx8="http://schemas.microsoft.com/office/drawing/2016/5/14/chartex" xmlns:mc="http://schemas.openxmlformats.org/markup-compatibility/2006" xmlns:aink="http://schemas.microsoft.com/office/drawing/2016/ink" xmlns:am3d="http://schemas.microsoft.com/office/drawing/2017/model3d" xmlns:o="urn:schemas-microsoft-com:office:office" xmlns:oel="http://schemas.microsoft.com/office/2019/extlst" xmlns:r="http://schemas.openxmlformats.org/officeDocument/2006/relationships" xmlns:m="http://schemas.openxmlformats.org/officeDocument/2006/math" xmlns:v="urn:schemas-microsoft-com:vml" xmlns:wp14="http://schemas.microsoft.com/office/word/2010/wordprocessingDrawing" xmlns:wp="http://schemas.openxmlformats.org/drawingml/2006/wordprocessingDrawing" xmlns:w10="urn:schemas-microsoft-com:office:word" xmlns:w="http://schemas.openxmlformats.org/wordprocessingml/2006/main" xmlns:w14="http://schemas.microsoft.com/office/word/2010/wordml" xmlns:w15="http://schemas.microsoft.com/office/word/2012/wordml" xmlns:w16cei="http://schemas.microsoft.com/office/word/2026/wordml/cei" xmlns:w16cex="http://schemas.microsoft.com/office/word/2018/wordml/cex" xmlns:w16cid="http://schemas.microsoft.com/office/word/2016/wordml/cid" xmlns:w16="http://schemas.microsoft.com/office/word/2018/wordml" xmlns:w16du="http://schemas.microsoft.com/office/word/2023/wordml/word16du" xmlns:w16sdtdh="http://schemas.microsoft.com/office/word/2020/wordml/sdtdatahash" xmlns:w16sdtfl="http://schemas.microsoft.com/office/word/2024/wordml/sdtformatlock" xmlns:w16se="http://schemas.microsoft.com/office/word/2015/wordml/symex" xmlns:wpg="http://schemas.microsoft.com/office/word/2010/wordprocessingGroup" xmlns:wpi="http://schemas.microsoft.com/office/word/2010/wordprocessingInk" xmlns:wne="http://schemas.microsoft.com/office/word/2006/wordml" xmlns:wps="http://schemas.microsoft.com/office/word/2010/wordprocessingShape" mc:Ignorable="w14 w15 w16se w16cid w16 w16cex w16sdtdh w16sdtfl w16du wp14">
+<w:comments xmlns:wpc="http://schemas.microsoft.com/office/word/2010/wordprocessingCanvas" xmlns:cx="http://schemas.microsoft.com/office/drawing/2014/chartex" xmlns:cx1="http://schemas.microsoft.com/office/drawing/2015/9/8/chartex" xmlns:cx2="http://schemas.microsoft.com/office/drawing/2015/10/21/chartex" xmlns:cx3="http://schemas.microsoft.com/office/drawing/2016/5/9/chartex" xmlns:cx4="http://schemas.microsoft.com/office/drawing/2016/5/10/chartex" xmlns:cx5="http://schemas.microsoft.com/office/drawing/2016/5/11/chartex" xmlns:cx6="http://schemas.microsoft.com/office/drawing/2016/5/12/chartex" xmlns:cx7="http://schemas.microsoft.com/office/drawing/2016/5/13/chartex" xmlns:cx8="http://schemas.microsoft.com/office/drawing/2016/5/14/chartex" xmlns:mc="http://schemas.openxmlformats.org/markup-compatibility/2006" xmlns:aink="http://schemas.microsoft.com/office/drawing/2016/ink" xmlns:am3d="http://schemas.microsoft.com/office/drawing/2017/model3d" xmlns:o="urn:schemas-microsoft-com:office:office" xmlns:oel="http://schemas.microsoft.com/office/2019/extlst" xmlns:r="http://schemas.openxmlformats.org/officeDocument/2006/relationships" xmlns:m="http://schemas.openxmlformats.org/officeDocument/2006/math" xmlns:v="urn:schemas-microsoft-com:vml" xmlns:wp14="http://schemas.microsoft.com/office/word/2010/wordprocessingDrawing" xmlns:wp="http://schemas.openxmlformats.org/drawingml/2006/wordprocessingDrawing" xmlns:w10="urn:schemas-microsoft-com:office:word" xmlns:w="http://schemas.openxmlformats.org/wordprocessingml/2006/main" xmlns:w14="http://schemas.microsoft.com/office/word/2010/wordml" xmlns:w15="http://schemas.microsoft.com/office/word/2012/wordml" xmlns:w16cex="http://schemas.microsoft.com/office/word/2018/wordml/cex" xmlns:w16cid="http://schemas.microsoft.com/office/word/2016/wordml/cid" xmlns:w16="http://schemas.microsoft.com/office/word/2018/wordml" xmlns:w16du="http://schemas.microsoft.com/office/word/2023/wordml/word16du" xmlns:w16sdtdh="http://schemas.microsoft.com/office/word/2020/wordml/sdtdatahash" xmlns:w16sdtfl="http://schemas.microsoft.com/office/word/2024/wordml/sdtformatlock" xmlns:w16se="http://schemas.microsoft.com/office/word/2015/wordml/symex" xmlns:wpg="http://schemas.microsoft.com/office/word/2010/wordprocessingGroup" xmlns:wpi="http://schemas.microsoft.com/office/word/2010/wordprocessingInk" xmlns:wne="http://schemas.microsoft.com/office/word/2006/wordml" xmlns:wps="http://schemas.microsoft.com/office/word/2010/wordprocessingShape" mc:Ignorable="w14 w15 w16se w16cid w16 w16cex w16sdtdh w16sdtfl w16du wp14">
   <w:comment w:id="0" w:author="Sebastiana Gomes" w:date="2026-08-13T20:36:00Z" w:initials="SG">
     <w:p>
       <w:pPr>
@@ -2097,25 +2102,25 @@
 </file>
 
 <file path=word/commentsExtended.xml><?xml version="1.0" encoding="utf-8"?>
-<w15:commentsEx xmlns:wpc="http://schemas.microsoft.com/office/word/2010/wordprocessingCanvas" xmlns:cx="http://schemas.microsoft.com/office/drawing/2014/chartex" xmlns:cx1="http://schemas.microsoft.com/office/drawing/2015/9/8/chartex" xmlns:cx2="http://schemas.microsoft.com/office/drawing/2015/10/21/chartex" xmlns:cx3="http://schemas.microsoft.com/office/drawing/2016/5/9/chartex" xmlns:cx4="http://schemas.microsoft.com/office/drawing/2016/5/10/chartex" xmlns:cx5="http://schemas.microsoft.com/office/drawing/2016/5/11/chartex" xmlns:cx6="http://schemas.microsoft.com/office/drawing/2016/5/12/chartex" xmlns:cx7="http://schemas.microsoft.com/office/drawing/2016/5/13/chartex" xmlns:cx8="http://schemas.microsoft.com/office/drawing/2016/5/14/chartex" xmlns:mc="http://schemas.openxmlformats.org/markup-compatibility/2006" xmlns:aink="http://schemas.microsoft.com/office/drawing/2016/ink" xmlns:am3d="http://schemas.microsoft.com/office/drawing/2017/model3d" xmlns:o="urn:schemas-microsoft-com:office:office" xmlns:oel="http://schemas.microsoft.com/office/2019/extlst" xmlns:r="http://schemas.openxmlformats.org/officeDocument/2006/relationships" xmlns:m="http://schemas.openxmlformats.org/officeDocument/2006/math" xmlns:v="urn:schemas-microsoft-com:vml" xmlns:wp14="http://schemas.microsoft.com/office/word/2010/wordprocessingDrawing" xmlns:wp="http://schemas.openxmlformats.org/drawingml/2006/wordprocessingDrawing" xmlns:w10="urn:schemas-microsoft-com:office:word" xmlns:w="http://schemas.openxmlformats.org/wordprocessingml/2006/main" xmlns:w14="http://schemas.microsoft.com/office/word/2010/wordml" xmlns:w15="http://schemas.microsoft.com/office/word/2012/wordml" xmlns:w16cei="http://schemas.microsoft.com/office/word/2026/wordml/cei" xmlns:w16cex="http://schemas.microsoft.com/office/word/2018/wordml/cex" xmlns:w16cid="http://schemas.microsoft.com/office/word/2016/wordml/cid" xmlns:w16="http://schemas.microsoft.com/office/word/2018/wordml" xmlns:w16du="http://schemas.microsoft.com/office/word/2023/wordml/word16du" xmlns:w16sdtdh="http://schemas.microsoft.com/office/word/2020/wordml/sdtdatahash" xmlns:w16sdtfl="http://schemas.microsoft.com/office/word/2024/wordml/sdtformatlock" xmlns:w16se="http://schemas.microsoft.com/office/word/2015/wordml/symex" xmlns:wpg="http://schemas.microsoft.com/office/word/2010/wordprocessingGroup" xmlns:wpi="http://schemas.microsoft.com/office/word/2010/wordprocessingInk" xmlns:wne="http://schemas.microsoft.com/office/word/2006/wordml" xmlns:wps="http://schemas.microsoft.com/office/word/2010/wordprocessingShape" mc:Ignorable="w14 w15 w16se w16cid w16 w16cex w16sdtdh w16sdtfl w16du wp14">
+<w15:commentsEx xmlns:wpc="http://schemas.microsoft.com/office/word/2010/wordprocessingCanvas" xmlns:cx="http://schemas.microsoft.com/office/drawing/2014/chartex" xmlns:cx1="http://schemas.microsoft.com/office/drawing/2015/9/8/chartex" xmlns:cx2="http://schemas.microsoft.com/office/drawing/2015/10/21/chartex" xmlns:cx3="http://schemas.microsoft.com/office/drawing/2016/5/9/chartex" xmlns:cx4="http://schemas.microsoft.com/office/drawing/2016/5/10/chartex" xmlns:cx5="http://schemas.microsoft.com/office/drawing/2016/5/11/chartex" xmlns:cx6="http://schemas.microsoft.com/office/drawing/2016/5/12/chartex" xmlns:cx7="http://schemas.microsoft.com/office/drawing/2016/5/13/chartex" xmlns:cx8="http://schemas.microsoft.com/office/drawing/2016/5/14/chartex" xmlns:mc="http://schemas.openxmlformats.org/markup-compatibility/2006" xmlns:aink="http://schemas.microsoft.com/office/drawing/2016/ink" xmlns:am3d="http://schemas.microsoft.com/office/drawing/2017/model3d" xmlns:o="urn:schemas-microsoft-com:office:office" xmlns:oel="http://schemas.microsoft.com/office/2019/extlst" xmlns:r="http://schemas.openxmlformats.org/officeDocument/2006/relationships" xmlns:m="http://schemas.openxmlformats.org/officeDocument/2006/math" xmlns:v="urn:schemas-microsoft-com:vml" xmlns:wp14="http://schemas.microsoft.com/office/word/2010/wordprocessingDrawing" xmlns:wp="http://schemas.openxmlformats.org/drawingml/2006/wordprocessingDrawing" xmlns:w10="urn:schemas-microsoft-com:office:word" xmlns:w="http://schemas.openxmlformats.org/wordprocessingml/2006/main" xmlns:w14="http://schemas.microsoft.com/office/word/2010/wordml" xmlns:w15="http://schemas.microsoft.com/office/word/2012/wordml" xmlns:w16cex="http://schemas.microsoft.com/office/word/2018/wordml/cex" xmlns:w16cid="http://schemas.microsoft.com/office/word/2016/wordml/cid" xmlns:w16="http://schemas.microsoft.com/office/word/2018/wordml" xmlns:w16du="http://schemas.microsoft.com/office/word/2023/wordml/word16du" xmlns:w16sdtdh="http://schemas.microsoft.com/office/word/2020/wordml/sdtdatahash" xmlns:w16sdtfl="http://schemas.microsoft.com/office/word/2024/wordml/sdtformatlock" xmlns:w16se="http://schemas.microsoft.com/office/word/2015/wordml/symex" xmlns:wpg="http://schemas.microsoft.com/office/word/2010/wordprocessingGroup" xmlns:wpi="http://schemas.microsoft.com/office/word/2010/wordprocessingInk" xmlns:wne="http://schemas.microsoft.com/office/word/2006/wordml" xmlns:wps="http://schemas.microsoft.com/office/word/2010/wordprocessingShape" mc:Ignorable="w14 w15 w16se w16cid w16 w16cex w16sdtdh w16sdtfl w16du wp14">
   <w15:commentEx w15:paraId="64D9CCBE" w15:done="0"/>
 </w15:commentsEx>
 </file>
 
 <file path=word/commentsExtensible.xml><?xml version="1.0" encoding="utf-8"?>
-<w16cex:commentsExtensible xmlns:wpc="http://schemas.microsoft.com/office/word/2010/wordprocessingCanvas" xmlns:cx="http://schemas.microsoft.com/office/drawing/2014/chartex" xmlns:cx1="http://schemas.microsoft.com/office/drawing/2015/9/8/chartex" xmlns:cx2="http://schemas.microsoft.com/office/drawing/2015/10/21/chartex" xmlns:cx3="http://schemas.microsoft.com/office/drawing/2016/5/9/chartex" xmlns:cx4="http://schemas.microsoft.com/office/drawing/2016/5/10/chartex" xmlns:cx5="http://schemas.microsoft.com/office/drawing/2016/5/11/chartex" xmlns:cx6="http://schemas.microsoft.com/office/drawing/2016/5/12/chartex" xmlns:cx7="http://schemas.microsoft.com/office/drawing/2016/5/13/chartex" xmlns:cx8="http://schemas.microsoft.com/office/drawing/2016/5/14/chartex" xmlns:cr="http://schemas.microsoft.com/office/comments/2020/reactions" xmlns:mc="http://schemas.openxmlformats.org/markup-compatibility/2006" xmlns:aink="http://schemas.microsoft.com/office/drawing/2016/ink" xmlns:am3d="http://schemas.microsoft.com/office/drawing/2017/model3d" xmlns:o="urn:schemas-microsoft-com:office:office" xmlns:oel="http://schemas.microsoft.com/office/2019/extlst" xmlns:r="http://schemas.openxmlformats.org/officeDocument/2006/relationships" xmlns:m="http://schemas.openxmlformats.org/officeDocument/2006/math" xmlns:v="urn:schemas-microsoft-com:vml" xmlns:wp14="http://schemas.microsoft.com/office/word/2010/wordprocessingDrawing" xmlns:wp="http://schemas.openxmlformats.org/drawingml/2006/wordprocessingDrawing" xmlns:w10="urn:schemas-microsoft-com:office:word" xmlns:w="http://schemas.openxmlformats.org/wordprocessingml/2006/main" xmlns:w14="http://schemas.microsoft.com/office/word/2010/wordml" xmlns:w15="http://schemas.microsoft.com/office/word/2012/wordml" xmlns:w16cei="http://schemas.microsoft.com/office/word/2026/wordml/cei" xmlns:w16cex="http://schemas.microsoft.com/office/word/2018/wordml/cex" xmlns:w16cid="http://schemas.microsoft.com/office/word/2016/wordml/cid" xmlns:w16="http://schemas.microsoft.com/office/word/2018/wordml" xmlns:w16du="http://schemas.microsoft.com/office/word/2023/wordml/word16du" xmlns:w16sdtdh="http://schemas.microsoft.com/office/word/2020/wordml/sdtdatahash" xmlns:w16sdtfl="http://schemas.microsoft.com/office/word/2024/wordml/sdtformatlock" xmlns:w16se="http://schemas.microsoft.com/office/word/2015/wordml/symex" xmlns:wpg="http://schemas.microsoft.com/office/word/2010/wordprocessingGroup" xmlns:wpi="http://schemas.microsoft.com/office/word/2010/wordprocessingInk" xmlns:wne="http://schemas.microsoft.com/office/word/2006/wordml" xmlns:wps="http://schemas.microsoft.com/office/word/2010/wordprocessingShape" mc:Ignorable="w14 w15 w16se w16cid w16 w16cex w16sdtdh w16sdtfl cr w16du wp14">
+<w16cex:commentsExtensible xmlns:wpc="http://schemas.microsoft.com/office/word/2010/wordprocessingCanvas" xmlns:cx="http://schemas.microsoft.com/office/drawing/2014/chartex" xmlns:cx1="http://schemas.microsoft.com/office/drawing/2015/9/8/chartex" xmlns:cx2="http://schemas.microsoft.com/office/drawing/2015/10/21/chartex" xmlns:cx3="http://schemas.microsoft.com/office/drawing/2016/5/9/chartex" xmlns:cx4="http://schemas.microsoft.com/office/drawing/2016/5/10/chartex" xmlns:cx5="http://schemas.microsoft.com/office/drawing/2016/5/11/chartex" xmlns:cx6="http://schemas.microsoft.com/office/drawing/2016/5/12/chartex" xmlns:cx7="http://schemas.microsoft.com/office/drawing/2016/5/13/chartex" xmlns:cx8="http://schemas.microsoft.com/office/drawing/2016/5/14/chartex" xmlns:cr="http://schemas.microsoft.com/office/comments/2020/reactions" xmlns:mc="http://schemas.openxmlformats.org/markup-compatibility/2006" xmlns:aink="http://schemas.microsoft.com/office/drawing/2016/ink" xmlns:am3d="http://schemas.microsoft.com/office/drawing/2017/model3d" xmlns:o="urn:schemas-microsoft-com:office:office" xmlns:oel="http://schemas.microsoft.com/office/2019/extlst" xmlns:r="http://schemas.openxmlformats.org/officeDocument/2006/relationships" xmlns:m="http://schemas.openxmlformats.org/officeDocument/2006/math" xmlns:v="urn:schemas-microsoft-com:vml" xmlns:wp14="http://schemas.microsoft.com/office/word/2010/wordprocessingDrawing" xmlns:wp="http://schemas.openxmlformats.org/drawingml/2006/wordprocessingDrawing" xmlns:w10="urn:schemas-microsoft-com:office:word" xmlns:w="http://schemas.openxmlformats.org/wordprocessingml/2006/main" xmlns:w14="http://schemas.microsoft.com/office/word/2010/wordml" xmlns:w15="http://schemas.microsoft.com/office/word/2012/wordml" xmlns:w16cex="http://schemas.microsoft.com/office/word/2018/wordml/cex" xmlns:w16cid="http://schemas.microsoft.com/office/word/2016/wordml/cid" xmlns:w16="http://schemas.microsoft.com/office/word/2018/wordml" xmlns:w16du="http://schemas.microsoft.com/office/word/2023/wordml/word16du" xmlns:w16sdtdh="http://schemas.microsoft.com/office/word/2020/wordml/sdtdatahash" xmlns:w16sdtfl="http://schemas.microsoft.com/office/word/2024/wordml/sdtformatlock" xmlns:w16se="http://schemas.microsoft.com/office/word/2015/wordml/symex" xmlns:wpg="http://schemas.microsoft.com/office/word/2010/wordprocessingGroup" xmlns:wpi="http://schemas.microsoft.com/office/word/2010/wordprocessingInk" xmlns:wne="http://schemas.microsoft.com/office/word/2006/wordml" xmlns:wps="http://schemas.microsoft.com/office/word/2010/wordprocessingShape" mc:Ignorable="w14 w15 w16se w16cid w16 w16cex w16sdtdh w16sdtfl cr w16du wp14">
   <w16cex:commentExtensible w16cex:durableId="38D7DC8B" w16cex:dateUtc="2026-08-13T23:36:00Z"/>
 </w16cex:commentsExtensible>
 </file>
 
 <file path=word/commentsIds.xml><?xml version="1.0" encoding="utf-8"?>
-<w16cid:commentsIds xmlns:wpc="http://schemas.microsoft.com/office/word/2010/wordprocessingCanvas" xmlns:cx="http://schemas.microsoft.com/office/drawing/2014/chartex" xmlns:cx1="http://schemas.microsoft.com/office/drawing/2015/9/8/chartex" xmlns:cx2="http://schemas.microsoft.com/office/drawing/2015/10/21/chartex" xmlns:cx3="http://schemas.microsoft.com/office/drawing/2016/5/9/chartex" xmlns:cx4="http://schemas.microsoft.com/office/drawing/2016/5/10/chartex" xmlns:cx5="http://schemas.microsoft.com/office/drawing/2016/5/11/chartex" xmlns:cx6="http://schemas.microsoft.com/office/drawing/2016/5/12/chartex" xmlns:cx7="http://schemas.microsoft.com/office/drawing/2016/5/13/chartex" xmlns:cx8="http://schemas.microsoft.com/office/drawing/2016/5/14/chartex" xmlns:mc="http://schemas.openxmlformats.org/markup-compatibility/2006" xmlns:aink="http://schemas.microsoft.com/office/drawing/2016/ink" xmlns:am3d="http://schemas.microsoft.com/office/drawing/2017/model3d" xmlns:o="urn:schemas-microsoft-com:office:office" xmlns:oel="http://schemas.microsoft.com/office/2019/extlst" xmlns:r="http://schemas.openxmlformats.org/officeDocument/2006/relationships" xmlns:m="http://schemas.openxmlformats.org/officeDocument/2006/math" xmlns:v="urn:schemas-microsoft-com:vml" xmlns:wp14="http://schemas.microsoft.com/office/word/2010/wordprocessingDrawing" xmlns:wp="http://schemas.openxmlformats.org/drawingml/2006/wordprocessingDrawing" xmlns:w10="urn:schemas-microsoft-com:office:word" xmlns:w="http://schemas.openxmlformats.org/wordprocessingml/2006/main" xmlns:w14="http://schemas.microsoft.com/office/word/2010/wordml" xmlns:w15="http://schemas.microsoft.com/office/word/2012/wordml" xmlns:w16cei="http://schemas.microsoft.com/office/word/2026/wordml/cei" xmlns:w16cex="http://schemas.microsoft.com/office/word/2018/wordml/cex" xmlns:w16cid="http://schemas.microsoft.com/office/word/2016/wordml/cid" xmlns:w16="http://schemas.microsoft.com/office/word/2018/wordml" xmlns:w16du="http://schemas.microsoft.com/office/word/2023/wordml/word16du" xmlns:w16sdtdh="http://schemas.microsoft.com/office/word/2020/wordml/sdtdatahash" xmlns:w16sdtfl="http://schemas.microsoft.com/office/word/2024/wordml/sdtformatlock" xmlns:w16se="http://schemas.microsoft.com/office/word/2015/wordml/symex" xmlns:wpg="http://schemas.microsoft.com/office/word/2010/wordprocessingGroup" xmlns:wpi="http://schemas.microsoft.com/office/word/2010/wordprocessingInk" xmlns:wne="http://schemas.microsoft.com/office/word/2006/wordml" xmlns:wps="http://schemas.microsoft.com/office/word/2010/wordprocessingShape" mc:Ignorable="w14 w15 w16se w16cid w16 w16cex w16sdtdh w16sdtfl w16du wp14">
+<w16cid:commentsIds xmlns:wpc="http://schemas.microsoft.com/office/word/2010/wordprocessingCanvas" xmlns:cx="http://schemas.microsoft.com/office/drawing/2014/chartex" xmlns:cx1="http://schemas.microsoft.com/office/drawing/2015/9/8/chartex" xmlns:cx2="http://schemas.microsoft.com/office/drawing/2015/10/21/chartex" xmlns:cx3="http://schemas.microsoft.com/office/drawing/2016/5/9/chartex" xmlns:cx4="http://schemas.microsoft.com/office/drawing/2016/5/10/chartex" xmlns:cx5="http://schemas.microsoft.com/office/drawing/2016/5/11/chartex" xmlns:cx6="http://schemas.microsoft.com/office/drawing/2016/5/12/chartex" xmlns:cx7="http://schemas.microsoft.com/office/drawing/2016/5/13/chartex" xmlns:cx8="http://schemas.microsoft.com/office/drawing/2016/5/14/chartex" xmlns:mc="http://schemas.openxmlformats.org/markup-compatibility/2006" xmlns:aink="http://schemas.microsoft.com/office/drawing/2016/ink" xmlns:am3d="http://schemas.microsoft.com/office/drawing/2017/model3d" xmlns:o="urn:schemas-microsoft-com:office:office" xmlns:oel="http://schemas.microsoft.com/office/2019/extlst" xmlns:r="http://schemas.openxmlformats.org/officeDocument/2006/relationships" xmlns:m="http://schemas.openxmlformats.org/officeDocument/2006/math" xmlns:v="urn:schemas-microsoft-com:vml" xmlns:wp14="http://schemas.microsoft.com/office/word/2010/wordprocessingDrawing" xmlns:wp="http://schemas.openxmlformats.org/drawingml/2006/wordprocessingDrawing" xmlns:w10="urn:schemas-microsoft-com:office:word" xmlns:w="http://schemas.openxmlformats.org/wordprocessingml/2006/main" xmlns:w14="http://schemas.microsoft.com/office/word/2010/wordml" xmlns:w15="http://schemas.microsoft.com/office/word/2012/wordml" xmlns:w16cex="http://schemas.microsoft.com/office/word/2018/wordml/cex" xmlns:w16cid="http://schemas.microsoft.com/office/word/2016/wordml/cid" xmlns:w16="http://schemas.microsoft.com/office/word/2018/wordml" xmlns:w16du="http://schemas.microsoft.com/office/word/2023/wordml/word16du" xmlns:w16sdtdh="http://schemas.microsoft.com/office/word/2020/wordml/sdtdatahash" xmlns:w16sdtfl="http://schemas.microsoft.com/office/word/2024/wordml/sdtformatlock" xmlns:w16se="http://schemas.microsoft.com/office/word/2015/wordml/symex" xmlns:wpg="http://schemas.microsoft.com/office/word/2010/wordprocessingGroup" xmlns:wpi="http://schemas.microsoft.com/office/word/2010/wordprocessingInk" xmlns:wne="http://schemas.microsoft.com/office/word/2006/wordml" xmlns:wps="http://schemas.microsoft.com/office/word/2010/wordprocessingShape" mc:Ignorable="w14 w15 w16se w16cid w16 w16cex w16sdtdh w16sdtfl w16du wp14">
   <w16cid:commentId w16cid:paraId="64D9CCBE" w16cid:durableId="38D7DC8B"/>
 </w16cid:commentsIds>
 </file>
 
 <file path=word/endnotes.xml><?xml version="1.0" encoding="utf-8"?>
-<w:endnotes xmlns:wpc="http://schemas.microsoft.com/office/word/2010/wordprocessingCanvas" xmlns:cx="http://schemas.microsoft.com/office/drawing/2014/chartex" xmlns:cx1="http://schemas.microsoft.com/office/drawing/2015/9/8/chartex" xmlns:cx2="http://schemas.microsoft.com/office/drawing/2015/10/21/chartex" xmlns:cx3="http://schemas.microsoft.com/office/drawing/2016/5/9/chartex" xmlns:cx4="http://schemas.microsoft.com/office/drawing/2016/5/10/chartex" xmlns:cx5="http://schemas.microsoft.com/office/drawing/2016/5/11/chartex" xmlns:cx6="http://schemas.microsoft.com/office/drawing/2016/5/12/chartex" xmlns:cx7="http://schemas.microsoft.com/office/drawing/2016/5/13/chartex" xmlns:cx8="http://schemas.microsoft.com/office/drawing/2016/5/14/chartex" xmlns:mc="http://schemas.openxmlformats.org/markup-compatibility/2006" xmlns:aink="http://schemas.microsoft.com/office/drawing/2016/ink" xmlns:am3d="http://schemas.microsoft.com/office/drawing/2017/model3d" xmlns:o="urn:schemas-microsoft-com:office:office" xmlns:oel="http://schemas.microsoft.com/office/2019/extlst" xmlns:r="http://schemas.openxmlformats.org/officeDocument/2006/relationships" xmlns:m="http://schemas.openxmlformats.org/officeDocument/2006/math" xmlns:v="urn:schemas-microsoft-com:vml" xmlns:wp14="http://schemas.microsoft.com/office/word/2010/wordprocessingDrawing" xmlns:wp="http://schemas.openxmlformats.org/drawingml/2006/wordprocessingDrawing" xmlns:w10="urn:schemas-microsoft-com:office:word" xmlns:w="http://schemas.openxmlformats.org/wordprocessingml/2006/main" xmlns:w14="http://schemas.microsoft.com/office/word/2010/wordml" xmlns:w15="http://schemas.microsoft.com/office/word/2012/wordml" xmlns:w16cei="http://schemas.microsoft.com/office/word/2026/wordml/cei" xmlns:w16cex="http://schemas.microsoft.com/office/word/2018/wordml/cex" xmlns:w16cid="http://schemas.microsoft.com/office/word/2016/wordml/cid" xmlns:w16="http://schemas.microsoft.com/office/word/2018/wordml" xmlns:w16du="http://schemas.microsoft.com/office/word/2023/wordml/word16du" xmlns:w16sdtdh="http://schemas.microsoft.com/office/word/2020/wordml/sdtdatahash" xmlns:w16sdtfl="http://schemas.microsoft.com/office/word/2024/wordml/sdtformatlock" xmlns:w16se="http://schemas.microsoft.com/office/word/2015/wordml/symex" xmlns:wpg="http://schemas.microsoft.com/office/word/2010/wordprocessingGroup" xmlns:wpi="http://schemas.microsoft.com/office/word/2010/wordprocessingInk" xmlns:wne="http://schemas.microsoft.com/office/word/2006/wordml" xmlns:wps="http://schemas.microsoft.com/office/word/2010/wordprocessingShape" mc:Ignorable="w14 w15 w16se w16cid w16 w16cex w16sdtdh w16sdtfl w16du wp14">
+<w:endnotes xmlns:wpc="http://schemas.microsoft.com/office/word/2010/wordprocessingCanvas" xmlns:cx="http://schemas.microsoft.com/office/drawing/2014/chartex" xmlns:cx1="http://schemas.microsoft.com/office/drawing/2015/9/8/chartex" xmlns:cx2="http://schemas.microsoft.com/office/drawing/2015/10/21/chartex" xmlns:cx3="http://schemas.microsoft.com/office/drawing/2016/5/9/chartex" xmlns:cx4="http://schemas.microsoft.com/office/drawing/2016/5/10/chartex" xmlns:cx5="http://schemas.microsoft.com/office/drawing/2016/5/11/chartex" xmlns:cx6="http://schemas.microsoft.com/office/drawing/2016/5/12/chartex" xmlns:cx7="http://schemas.microsoft.com/office/drawing/2016/5/13/chartex" xmlns:cx8="http://schemas.microsoft.com/office/drawing/2016/5/14/chartex" xmlns:mc="http://schemas.openxmlformats.org/markup-compatibility/2006" xmlns:aink="http://schemas.microsoft.com/office/drawing/2016/ink" xmlns:am3d="http://schemas.microsoft.com/office/drawing/2017/model3d" xmlns:o="urn:schemas-microsoft-com:office:office" xmlns:oel="http://schemas.microsoft.com/office/2019/extlst" xmlns:r="http://schemas.openxmlformats.org/officeDocument/2006/relationships" xmlns:m="http://schemas.openxmlformats.org/officeDocument/2006/math" xmlns:v="urn:schemas-microsoft-com:vml" xmlns:wp14="http://schemas.microsoft.com/office/word/2010/wordprocessingDrawing" xmlns:wp="http://schemas.openxmlformats.org/drawingml/2006/wordprocessingDrawing" xmlns:w10="urn:schemas-microsoft-com:office:word" xmlns:w="http://schemas.openxmlformats.org/wordprocessingml/2006/main" xmlns:w14="http://schemas.microsoft.com/office/word/2010/wordml" xmlns:w15="http://schemas.microsoft.com/office/word/2012/wordml" xmlns:w16cex="http://schemas.microsoft.com/office/word/2018/wordml/cex" xmlns:w16cid="http://schemas.microsoft.com/office/word/2016/wordml/cid" xmlns:w16="http://schemas.microsoft.com/office/word/2018/wordml" xmlns:w16du="http://schemas.microsoft.com/office/word/2023/wordml/word16du" xmlns:w16sdtdh="http://schemas.microsoft.com/office/word/2020/wordml/sdtdatahash" xmlns:w16sdtfl="http://schemas.microsoft.com/office/word/2024/wordml/sdtformatlock" xmlns:w16se="http://schemas.microsoft.com/office/word/2015/wordml/symex" xmlns:wpg="http://schemas.microsoft.com/office/word/2010/wordprocessingGroup" xmlns:wpi="http://schemas.microsoft.com/office/word/2010/wordprocessingInk" xmlns:wne="http://schemas.microsoft.com/office/word/2006/wordml" xmlns:wps="http://schemas.microsoft.com/office/word/2010/wordprocessingShape" mc:Ignorable="w14 w15 w16se w16cid w16 w16cex w16sdtdh w16sdtfl w16du wp14">
   <w:endnote w:type="separator" w:id="-1">
     <w:p>
       <w:pPr>
@@ -2140,7 +2145,7 @@
 </file>
 
 <file path=word/footer1.xml><?xml version="1.0" encoding="utf-8"?>
-<w:ftr xmlns:wpc="http://schemas.microsoft.com/office/word/2010/wordprocessingCanvas" xmlns:cx="http://schemas.microsoft.com/office/drawing/2014/chartex" xmlns:cx1="http://schemas.microsoft.com/office/drawing/2015/9/8/chartex" xmlns:cx2="http://schemas.microsoft.com/office/drawing/2015/10/21/chartex" xmlns:cx3="http://schemas.microsoft.com/office/drawing/2016/5/9/chartex" xmlns:cx4="http://schemas.microsoft.com/office/drawing/2016/5/10/chartex" xmlns:cx5="http://schemas.microsoft.com/office/drawing/2016/5/11/chartex" xmlns:cx6="http://schemas.microsoft.com/office/drawing/2016/5/12/chartex" xmlns:cx7="http://schemas.microsoft.com/office/drawing/2016/5/13/chartex" xmlns:cx8="http://schemas.microsoft.com/office/drawing/2016/5/14/chartex" xmlns:mc="http://schemas.openxmlformats.org/markup-compatibility/2006" xmlns:aink="http://schemas.microsoft.com/office/drawing/2016/ink" xmlns:am3d="http://schemas.microsoft.com/office/drawing/2017/model3d" xmlns:o="urn:schemas-microsoft-com:office:office" xmlns:oel="http://schemas.microsoft.com/office/2019/extlst" xmlns:r="http://schemas.openxmlformats.org/officeDocument/2006/relationships" xmlns:m="http://schemas.openxmlformats.org/officeDocument/2006/math" xmlns:v="urn:schemas-microsoft-com:vml" xmlns:wp14="http://schemas.microsoft.com/office/word/2010/wordprocessingDrawing" xmlns:wp="http://schemas.openxmlformats.org/drawingml/2006/wordprocessingDrawing" xmlns:w10="urn:schemas-microsoft-com:office:word" xmlns:w="http://schemas.openxmlformats.org/wordprocessingml/2006/main" xmlns:w14="http://schemas.microsoft.com/office/word/2010/wordml" xmlns:w15="http://schemas.microsoft.com/office/word/2012/wordml" xmlns:w16cei="http://schemas.microsoft.com/office/word/2026/wordml/cei" xmlns:w16cex="http://schemas.microsoft.com/office/word/2018/wordml/cex" xmlns:w16cid="http://schemas.microsoft.com/office/word/2016/wordml/cid" xmlns:w16="http://schemas.microsoft.com/office/word/2018/wordml" xmlns:w16du="http://schemas.microsoft.com/office/word/2023/wordml/word16du" xmlns:w16sdtdh="http://schemas.microsoft.com/office/word/2020/wordml/sdtdatahash" xmlns:w16sdtfl="http://schemas.microsoft.com/office/word/2024/wordml/sdtformatlock" xmlns:w16se="http://schemas.microsoft.com/office/word/2015/wordml/symex" xmlns:wpg="http://schemas.microsoft.com/office/word/2010/wordprocessingGroup" xmlns:wpi="http://schemas.microsoft.com/office/word/2010/wordprocessingInk" xmlns:wne="http://schemas.microsoft.com/office/word/2006/wordml" xmlns:wps="http://schemas.microsoft.com/office/word/2010/wordprocessingShape" mc:Ignorable="w14 w15 w16se w16cid w16 w16cex w16sdtdh w16sdtfl w16du wp14">
+<w:ftr xmlns:wpc="http://schemas.microsoft.com/office/word/2010/wordprocessingCanvas" xmlns:cx="http://schemas.microsoft.com/office/drawing/2014/chartex" xmlns:cx1="http://schemas.microsoft.com/office/drawing/2015/9/8/chartex" xmlns:cx2="http://schemas.microsoft.com/office/drawing/2015/10/21/chartex" xmlns:cx3="http://schemas.microsoft.com/office/drawing/2016/5/9/chartex" xmlns:cx4="http://schemas.microsoft.com/office/drawing/2016/5/10/chartex" xmlns:cx5="http://schemas.microsoft.com/office/drawing/2016/5/11/chartex" xmlns:cx6="http://schemas.microsoft.com/office/drawing/2016/5/12/chartex" xmlns:cx7="http://schemas.microsoft.com/office/drawing/2016/5/13/chartex" xmlns:cx8="http://schemas.microsoft.com/office/drawing/2016/5/14/chartex" xmlns:mc="http://schemas.openxmlformats.org/markup-compatibility/2006" xmlns:aink="http://schemas.microsoft.com/office/drawing/2016/ink" xmlns:am3d="http://schemas.microsoft.com/office/drawing/2017/model3d" xmlns:o="urn:schemas-microsoft-com:office:office" xmlns:oel="http://schemas.microsoft.com/office/2019/extlst" xmlns:r="http://schemas.openxmlformats.org/officeDocument/2006/relationships" xmlns:m="http://schemas.openxmlformats.org/officeDocument/2006/math" xmlns:v="urn:schemas-microsoft-com:vml" xmlns:wp14="http://schemas.microsoft.com/office/word/2010/wordprocessingDrawing" xmlns:wp="http://schemas.openxmlformats.org/drawingml/2006/wordprocessingDrawing" xmlns:w10="urn:schemas-microsoft-com:office:word" xmlns:w="http://schemas.openxmlformats.org/wordprocessingml/2006/main" xmlns:w14="http://schemas.microsoft.com/office/word/2010/wordml" xmlns:w15="http://schemas.microsoft.com/office/word/2012/wordml" xmlns:w16cex="http://schemas.microsoft.com/office/word/2018/wordml/cex" xmlns:w16cid="http://schemas.microsoft.com/office/word/2016/wordml/cid" xmlns:w16="http://schemas.microsoft.com/office/word/2018/wordml" xmlns:w16du="http://schemas.microsoft.com/office/word/2023/wordml/word16du" xmlns:w16sdtdh="http://schemas.microsoft.com/office/word/2020/wordml/sdtdatahash" xmlns:w16sdtfl="http://schemas.microsoft.com/office/word/2024/wordml/sdtformatlock" xmlns:w16se="http://schemas.microsoft.com/office/word/2015/wordml/symex" xmlns:wpg="http://schemas.microsoft.com/office/word/2010/wordprocessingGroup" xmlns:wpi="http://schemas.microsoft.com/office/word/2010/wordprocessingInk" xmlns:wne="http://schemas.microsoft.com/office/word/2006/wordml" xmlns:wps="http://schemas.microsoft.com/office/word/2010/wordprocessingShape" mc:Ignorable="w14 w15 w16se w16cid w16 w16cex w16sdtdh w16sdtfl w16du wp14">
   <w:p>
     <w:pPr>
       <w:pStyle w:val="Rodap"/>
@@ -2285,7 +2290,7 @@
 </file>
 
 <file path=word/footnotes.xml><?xml version="1.0" encoding="utf-8"?>
-<w:footnotes xmlns:wpc="http://schemas.microsoft.com/office/word/2010/wordprocessingCanvas" xmlns:cx="http://schemas.microsoft.com/office/drawing/2014/chartex" xmlns:cx1="http://schemas.microsoft.com/office/drawing/2015/9/8/chartex" xmlns:cx2="http://schemas.microsoft.com/office/drawing/2015/10/21/chartex" xmlns:cx3="http://schemas.microsoft.com/office/drawing/2016/5/9/chartex" xmlns:cx4="http://schemas.microsoft.com/office/drawing/2016/5/10/chartex" xmlns:cx5="http://schemas.microsoft.com/office/drawing/2016/5/11/chartex" xmlns:cx6="http://schemas.microsoft.com/office/drawing/2016/5/12/chartex" xmlns:cx7="http://schemas.microsoft.com/office/drawing/2016/5/13/chartex" xmlns:cx8="http://schemas.microsoft.com/office/drawing/2016/5/14/chartex" xmlns:mc="http://schemas.openxmlformats.org/markup-compatibility/2006" xmlns:aink="http://schemas.microsoft.com/office/drawing/2016/ink" xmlns:am3d="http://schemas.microsoft.com/office/drawing/2017/model3d" xmlns:o="urn:schemas-microsoft-com:office:office" xmlns:oel="http://schemas.microsoft.com/office/2019/extlst" xmlns:r="http://schemas.openxmlformats.org/officeDocument/2006/relationships" xmlns:m="http://schemas.openxmlformats.org/officeDocument/2006/math" xmlns:v="urn:schemas-microsoft-com:vml" xmlns:wp14="http://schemas.microsoft.com/office/word/2010/wordprocessingDrawing" xmlns:wp="http://schemas.openxmlformats.org/drawingml/2006/wordprocessingDrawing" xmlns:w10="urn:schemas-microsoft-com:office:word" xmlns:w="http://schemas.openxmlformats.org/wordprocessingml/2006/main" xmlns:w14="http://schemas.microsoft.com/office/word/2010/wordml" xmlns:w15="http://schemas.microsoft.com/office/word/2012/wordml" xmlns:w16cei="http://schemas.microsoft.com/office/word/2026/wordml/cei" xmlns:w16cex="http://schemas.microsoft.com/office/word/2018/wordml/cex" xmlns:w16cid="http://schemas.microsoft.com/office/word/2016/wordml/cid" xmlns:w16="http://schemas.microsoft.com/office/word/2018/wordml" xmlns:w16du="http://schemas.microsoft.com/office/word/2023/wordml/word16du" xmlns:w16sdtdh="http://schemas.microsoft.com/office/word/2020/wordml/sdtdatahash" xmlns:w16sdtfl="http://schemas.microsoft.com/office/word/2024/wordml/sdtformatlock" xmlns:w16se="http://schemas.microsoft.com/office/word/2015/wordml/symex" xmlns:wpg="http://schemas.microsoft.com/office/word/2010/wordprocessingGroup" xmlns:wpi="http://schemas.microsoft.com/office/word/2010/wordprocessingInk" xmlns:wne="http://schemas.microsoft.com/office/word/2006/wordml" xmlns:wps="http://schemas.microsoft.com/office/word/2010/wordprocessingShape" mc:Ignorable="w14 w15 w16se w16cid w16 w16cex w16sdtdh w16sdtfl w16du wp14">
+<w:footnotes xmlns:wpc="http://schemas.microsoft.com/office/word/2010/wordprocessingCanvas" xmlns:cx="http://schemas.microsoft.com/office/drawing/2014/chartex" xmlns:cx1="http://schemas.microsoft.com/office/drawing/2015/9/8/chartex" xmlns:cx2="http://schemas.microsoft.com/office/drawing/2015/10/21/chartex" xmlns:cx3="http://schemas.microsoft.com/office/drawing/2016/5/9/chartex" xmlns:cx4="http://schemas.microsoft.com/office/drawing/2016/5/10/chartex" xmlns:cx5="http://schemas.microsoft.com/office/drawing/2016/5/11/chartex" xmlns:cx6="http://schemas.microsoft.com/office/drawing/2016/5/12/chartex" xmlns:cx7="http://schemas.microsoft.com/office/drawing/2016/5/13/chartex" xmlns:cx8="http://schemas.microsoft.com/office/drawing/2016/5/14/chartex" xmlns:mc="http://schemas.openxmlformats.org/markup-compatibility/2006" xmlns:aink="http://schemas.microsoft.com/office/drawing/2016/ink" xmlns:am3d="http://schemas.microsoft.com/office/drawing/2017/model3d" xmlns:o="urn:schemas-microsoft-com:office:office" xmlns:oel="http://schemas.microsoft.com/office/2019/extlst" xmlns:r="http://schemas.openxmlformats.org/officeDocument/2006/relationships" xmlns:m="http://schemas.openxmlformats.org/officeDocument/2006/math" xmlns:v="urn:schemas-microsoft-com:vml" xmlns:wp14="http://schemas.microsoft.com/office/word/2010/wordprocessingDrawing" xmlns:wp="http://schemas.openxmlformats.org/drawingml/2006/wordprocessingDrawing" xmlns:w10="urn:schemas-microsoft-com:office:word" xmlns:w="http://schemas.openxmlformats.org/wordprocessingml/2006/main" xmlns:w14="http://schemas.microsoft.com/office/word/2010/wordml" xmlns:w15="http://schemas.microsoft.com/office/word/2012/wordml" xmlns:w16cex="http://schemas.microsoft.com/office/word/2018/wordml/cex" xmlns:w16cid="http://schemas.microsoft.com/office/word/2016/wordml/cid" xmlns:w16="http://schemas.microsoft.com/office/word/2018/wordml" xmlns:w16du="http://schemas.microsoft.com/office/word/2023/wordml/word16du" xmlns:w16sdtdh="http://schemas.microsoft.com/office/word/2020/wordml/sdtdatahash" xmlns:w16sdtfl="http://schemas.microsoft.com/office/word/2024/wordml/sdtformatlock" xmlns:w16se="http://schemas.microsoft.com/office/word/2015/wordml/symex" xmlns:wpg="http://schemas.microsoft.com/office/word/2010/wordprocessingGroup" xmlns:wpi="http://schemas.microsoft.com/office/word/2010/wordprocessingInk" xmlns:wne="http://schemas.microsoft.com/office/word/2006/wordml" xmlns:wps="http://schemas.microsoft.com/office/word/2010/wordprocessingShape" mc:Ignorable="w14 w15 w16se w16cid w16 w16cex w16sdtdh w16sdtfl w16du wp14">
   <w:footnote w:type="separator" w:id="-1">
     <w:p>
       <w:pPr>
@@ -2310,7 +2315,7 @@
 </file>
 
 <file path=word/header1.xml><?xml version="1.0" encoding="utf-8"?>
-<w:hdr xmlns:wpc="http://schemas.microsoft.com/office/word/2010/wordprocessingCanvas" xmlns:cx="http://schemas.microsoft.com/office/drawing/2014/chartex" xmlns:cx1="http://schemas.microsoft.com/office/drawing/2015/9/8/chartex" xmlns:cx2="http://schemas.microsoft.com/office/drawing/2015/10/21/chartex" xmlns:cx3="http://schemas.microsoft.com/office/drawing/2016/5/9/chartex" xmlns:cx4="http://schemas.microsoft.com/office/drawing/2016/5/10/chartex" xmlns:cx5="http://schemas.microsoft.com/office/drawing/2016/5/11/chartex" xmlns:cx6="http://schemas.microsoft.com/office/drawing/2016/5/12/chartex" xmlns:cx7="http://schemas.microsoft.com/office/drawing/2016/5/13/chartex" xmlns:cx8="http://schemas.microsoft.com/office/drawing/2016/5/14/chartex" xmlns:mc="http://schemas.openxmlformats.org/markup-compatibility/2006" xmlns:aink="http://schemas.microsoft.com/office/drawing/2016/ink" xmlns:am3d="http://schemas.microsoft.com/office/drawing/2017/model3d" xmlns:o="urn:schemas-microsoft-com:office:office" xmlns:oel="http://schemas.microsoft.com/office/2019/extlst" xmlns:r="http://schemas.openxmlformats.org/officeDocument/2006/relationships" xmlns:m="http://schemas.openxmlformats.org/officeDocument/2006/math" xmlns:v="urn:schemas-microsoft-com:vml" xmlns:wp14="http://schemas.microsoft.com/office/word/2010/wordprocessingDrawing" xmlns:wp="http://schemas.openxmlformats.org/drawingml/2006/wordprocessingDrawing" xmlns:w10="urn:schemas-microsoft-com:office:word" xmlns:w="http://schemas.openxmlformats.org/wordprocessingml/2006/main" xmlns:w14="http://schemas.microsoft.com/office/word/2010/wordml" xmlns:w15="http://schemas.microsoft.com/office/word/2012/wordml" xmlns:w16cei="http://schemas.microsoft.com/office/word/2026/wordml/cei" xmlns:w16cex="http://schemas.microsoft.com/office/word/2018/wordml/cex" xmlns:w16cid="http://schemas.microsoft.com/office/word/2016/wordml/cid" xmlns:w16="http://schemas.microsoft.com/office/word/2018/wordml" xmlns:w16du="http://schemas.microsoft.com/office/word/2023/wordml/word16du" xmlns:w16sdtdh="http://schemas.microsoft.com/office/word/2020/wordml/sdtdatahash" xmlns:w16sdtfl="http://schemas.microsoft.com/office/word/2024/wordml/sdtformatlock" xmlns:w16se="http://schemas.microsoft.com/office/word/2015/wordml/symex" xmlns:wpg="http://schemas.microsoft.com/office/word/2010/wordprocessingGroup" xmlns:wpi="http://schemas.microsoft.com/office/word/2010/wordprocessingInk" xmlns:wne="http://schemas.microsoft.com/office/word/2006/wordml" xmlns:wps="http://schemas.microsoft.com/office/word/2010/wordprocessingShape" mc:Ignorable="w14 w15 w16se w16cid w16 w16cex w16sdtdh w16sdtfl w16du wp14">
+<w:hdr xmlns:wpc="http://schemas.microsoft.com/office/word/2010/wordprocessingCanvas" xmlns:cx="http://schemas.microsoft.com/office/drawing/2014/chartex" xmlns:cx1="http://schemas.microsoft.com/office/drawing/2015/9/8/chartex" xmlns:cx2="http://schemas.microsoft.com/office/drawing/2015/10/21/chartex" xmlns:cx3="http://schemas.microsoft.com/office/drawing/2016/5/9/chartex" xmlns:cx4="http://schemas.microsoft.com/office/drawing/2016/5/10/chartex" xmlns:cx5="http://schemas.microsoft.com/office/drawing/2016/5/11/chartex" xmlns:cx6="http://schemas.microsoft.com/office/drawing/2016/5/12/chartex" xmlns:cx7="http://schemas.microsoft.com/office/drawing/2016/5/13/chartex" xmlns:cx8="http://schemas.microsoft.com/office/drawing/2016/5/14/chartex" xmlns:mc="http://schemas.openxmlformats.org/markup-compatibility/2006" xmlns:aink="http://schemas.microsoft.com/office/drawing/2016/ink" xmlns:am3d="http://schemas.microsoft.com/office/drawing/2017/model3d" xmlns:o="urn:schemas-microsoft-com:office:office" xmlns:oel="http://schemas.microsoft.com/office/2019/extlst" xmlns:r="http://schemas.openxmlformats.org/officeDocument/2006/relationships" xmlns:m="http://schemas.openxmlformats.org/officeDocument/2006/math" xmlns:v="urn:schemas-microsoft-com:vml" xmlns:wp14="http://schemas.microsoft.com/office/word/2010/wordprocessingDrawing" xmlns:wp="http://schemas.openxmlformats.org/drawingml/2006/wordprocessingDrawing" xmlns:w10="urn:schemas-microsoft-com:office:word" xmlns:w="http://schemas.openxmlformats.org/wordprocessingml/2006/main" xmlns:w14="http://schemas.microsoft.com/office/word/2010/wordml" xmlns:w15="http://schemas.microsoft.com/office/word/2012/wordml" xmlns:w16cex="http://schemas.microsoft.com/office/word/2018/wordml/cex" xmlns:w16cid="http://schemas.microsoft.com/office/word/2016/wordml/cid" xmlns:w16="http://schemas.microsoft.com/office/word/2018/wordml" xmlns:w16du="http://schemas.microsoft.com/office/word/2023/wordml/word16du" xmlns:w16sdtdh="http://schemas.microsoft.com/office/word/2020/wordml/sdtdatahash" xmlns:w16sdtfl="http://schemas.microsoft.com/office/word/2024/wordml/sdtformatlock" xmlns:w16se="http://schemas.microsoft.com/office/word/2015/wordml/symex" xmlns:wpg="http://schemas.microsoft.com/office/word/2010/wordprocessingGroup" xmlns:wpi="http://schemas.microsoft.com/office/word/2010/wordprocessingInk" xmlns:wne="http://schemas.microsoft.com/office/word/2006/wordml" xmlns:wps="http://schemas.microsoft.com/office/word/2010/wordprocessingShape" mc:Ignorable="w14 w15 w16se w16cid w16 w16cex w16sdtdh w16sdtfl w16du wp14">
   <w:p>
     <w:pPr>
       <w:pStyle w:val="Cabealho"/>
@@ -2361,7 +2366,7 @@
 </file>
 
 <file path=word/numbering.xml><?xml version="1.0" encoding="utf-8"?>
-<w:numbering xmlns:wpc="http://schemas.microsoft.com/office/word/2010/wordprocessingCanvas" xmlns:cx="http://schemas.microsoft.com/office/drawing/2014/chartex" xmlns:cx1="http://schemas.microsoft.com/office/drawing/2015/9/8/chartex" xmlns:cx2="http://schemas.microsoft.com/office/drawing/2015/10/21/chartex" xmlns:cx3="http://schemas.microsoft.com/office/drawing/2016/5/9/chartex" xmlns:cx4="http://schemas.microsoft.com/office/drawing/2016/5/10/chartex" xmlns:cx5="http://schemas.microsoft.com/office/drawing/2016/5/11/chartex" xmlns:cx6="http://schemas.microsoft.com/office/drawing/2016/5/12/chartex" xmlns:cx7="http://schemas.microsoft.com/office/drawing/2016/5/13/chartex" xmlns:cx8="http://schemas.microsoft.com/office/drawing/2016/5/14/chartex" xmlns:mc="http://schemas.openxmlformats.org/markup-compatibility/2006" xmlns:aink="http://schemas.microsoft.com/office/drawing/2016/ink" xmlns:am3d="http://schemas.microsoft.com/office/drawing/2017/model3d" xmlns:o="urn:schemas-microsoft-com:office:office" xmlns:oel="http://schemas.microsoft.com/office/2019/extlst" xmlns:r="http://schemas.openxmlformats.org/officeDocument/2006/relationships" xmlns:m="http://schemas.openxmlformats.org/officeDocument/2006/math" xmlns:v="urn:schemas-microsoft-com:vml" xmlns:wp14="http://schemas.microsoft.com/office/word/2010/wordprocessingDrawing" xmlns:wp="http://schemas.openxmlformats.org/drawingml/2006/wordprocessingDrawing" xmlns:w10="urn:schemas-microsoft-com:office:word" xmlns:w="http://schemas.openxmlformats.org/wordprocessingml/2006/main" xmlns:w14="http://schemas.microsoft.com/office/word/2010/wordml" xmlns:w15="http://schemas.microsoft.com/office/word/2012/wordml" xmlns:w16cei="http://schemas.microsoft.com/office/word/2026/wordml/cei" xmlns:w16cex="http://schemas.microsoft.com/office/word/2018/wordml/cex" xmlns:w16cid="http://schemas.microsoft.com/office/word/2016/wordml/cid" xmlns:w16="http://schemas.microsoft.com/office/word/2018/wordml" xmlns:w16du="http://schemas.microsoft.com/office/word/2023/wordml/word16du" xmlns:w16sdtdh="http://schemas.microsoft.com/office/word/2020/wordml/sdtdatahash" xmlns:w16sdtfl="http://schemas.microsoft.com/office/word/2024/wordml/sdtformatlock" xmlns:w16se="http://schemas.microsoft.com/office/word/2015/wordml/symex" xmlns:wpg="http://schemas.microsoft.com/office/word/2010/wordprocessingGroup" xmlns:wpi="http://schemas.microsoft.com/office/word/2010/wordprocessingInk" xmlns:wne="http://schemas.microsoft.com/office/word/2006/wordml" xmlns:wps="http://schemas.microsoft.com/office/word/2010/wordprocessingShape" mc:Ignorable="w14 w15 w16se w16cid w16 w16cex w16sdtdh w16sdtfl w16du wp14">
+<w:numbering xmlns:wpc="http://schemas.microsoft.com/office/word/2010/wordprocessingCanvas" xmlns:cx="http://schemas.microsoft.com/office/drawing/2014/chartex" xmlns:cx1="http://schemas.microsoft.com/office/drawing/2015/9/8/chartex" xmlns:cx2="http://schemas.microsoft.com/office/drawing/2015/10/21/chartex" xmlns:cx3="http://schemas.microsoft.com/office/drawing/2016/5/9/chartex" xmlns:cx4="http://schemas.microsoft.com/office/drawing/2016/5/10/chartex" xmlns:cx5="http://schemas.microsoft.com/office/drawing/2016/5/11/chartex" xmlns:cx6="http://schemas.microsoft.com/office/drawing/2016/5/12/chartex" xmlns:cx7="http://schemas.microsoft.com/office/drawing/2016/5/13/chartex" xmlns:cx8="http://schemas.microsoft.com/office/drawing/2016/5/14/chartex" xmlns:mc="http://schemas.openxmlformats.org/markup-compatibility/2006" xmlns:aink="http://schemas.microsoft.com/office/drawing/2016/ink" xmlns:am3d="http://schemas.microsoft.com/office/drawing/2017/model3d" xmlns:o="urn:schemas-microsoft-com:office:office" xmlns:oel="http://schemas.microsoft.com/office/2019/extlst" xmlns:r="http://schemas.openxmlformats.org/officeDocument/2006/relationships" xmlns:m="http://schemas.openxmlformats.org/officeDocument/2006/math" xmlns:v="urn:schemas-microsoft-com:vml" xmlns:wp14="http://schemas.microsoft.com/office/word/2010/wordprocessingDrawing" xmlns:wp="http://schemas.openxmlformats.org/drawingml/2006/wordprocessingDrawing" xmlns:w10="urn:schemas-microsoft-com:office:word" xmlns:w="http://schemas.openxmlformats.org/wordprocessingml/2006/main" xmlns:w14="http://schemas.microsoft.com/office/word/2010/wordml" xmlns:w15="http://schemas.microsoft.com/office/word/2012/wordml" xmlns:w16cex="http://schemas.microsoft.com/office/word/2018/wordml/cex" xmlns:w16cid="http://schemas.microsoft.com/office/word/2016/wordml/cid" xmlns:w16="http://schemas.microsoft.com/office/word/2018/wordml" xmlns:w16du="http://schemas.microsoft.com/office/word/2023/wordml/word16du" xmlns:w16sdtdh="http://schemas.microsoft.com/office/word/2020/wordml/sdtdatahash" xmlns:w16sdtfl="http://schemas.microsoft.com/office/word/2024/wordml/sdtformatlock" xmlns:w16se="http://schemas.microsoft.com/office/word/2015/wordml/symex" xmlns:wpg="http://schemas.microsoft.com/office/word/2010/wordprocessingGroup" xmlns:wpi="http://schemas.microsoft.com/office/word/2010/wordprocessingInk" xmlns:wne="http://schemas.microsoft.com/office/word/2006/wordml" xmlns:wps="http://schemas.microsoft.com/office/word/2010/wordprocessingShape" mc:Ignorable="w14 w15 w16se w16cid w16 w16cex w16sdtdh w16sdtfl w16du wp14">
   <w:abstractNum w:abstractNumId="0" w15:restartNumberingAfterBreak="0">
     <w:nsid w:val="FFFFFF7C"/>
     <w:multiLevelType w:val="singleLevel"/>
@@ -2683,7 +2688,7 @@
 </file>
 
 <file path=word/people.xml><?xml version="1.0" encoding="utf-8"?>
-<w15:people xmlns:wpc="http://schemas.microsoft.com/office/word/2010/wordprocessingCanvas" xmlns:cx="http://schemas.microsoft.com/office/drawing/2014/chartex" xmlns:cx1="http://schemas.microsoft.com/office/drawing/2015/9/8/chartex" xmlns:cx2="http://schemas.microsoft.com/office/drawing/2015/10/21/chartex" xmlns:cx3="http://schemas.microsoft.com/office/drawing/2016/5/9/chartex" xmlns:cx4="http://schemas.microsoft.com/office/drawing/2016/5/10/chartex" xmlns:cx5="http://schemas.microsoft.com/office/drawing/2016/5/11/chartex" xmlns:cx6="http://schemas.microsoft.com/office/drawing/2016/5/12/chartex" xmlns:cx7="http://schemas.microsoft.com/office/drawing/2016/5/13/chartex" xmlns:cx8="http://schemas.microsoft.com/office/drawing/2016/5/14/chartex" xmlns:mc="http://schemas.openxmlformats.org/markup-compatibility/2006" xmlns:aink="http://schemas.microsoft.com/office/drawing/2016/ink" xmlns:am3d="http://schemas.microsoft.com/office/drawing/2017/model3d" xmlns:o="urn:schemas-microsoft-com:office:office" xmlns:oel="http://schemas.microsoft.com/office/2019/extlst" xmlns:r="http://schemas.openxmlformats.org/officeDocument/2006/relationships" xmlns:m="http://schemas.openxmlformats.org/officeDocument/2006/math" xmlns:v="urn:schemas-microsoft-com:vml" xmlns:wp14="http://schemas.microsoft.com/office/word/2010/wordprocessingDrawing" xmlns:wp="http://schemas.openxmlformats.org/drawingml/2006/wordprocessingDrawing" xmlns:w10="urn:schemas-microsoft-com:office:word" xmlns:w="http://schemas.openxmlformats.org/wordprocessingml/2006/main" xmlns:w14="http://schemas.microsoft.com/office/word/2010/wordml" xmlns:w15="http://schemas.microsoft.com/office/word/2012/wordml" xmlns:w16cei="http://schemas.microsoft.com/office/word/2026/wordml/cei" xmlns:w16cex="http://schemas.microsoft.com/office/word/2018/wordml/cex" xmlns:w16cid="http://schemas.microsoft.com/office/word/2016/wordml/cid" xmlns:w16="http://schemas.microsoft.com/office/word/2018/wordml" xmlns:w16du="http://schemas.microsoft.com/office/word/2023/wordml/word16du" xmlns:w16sdtdh="http://schemas.microsoft.com/office/word/2020/wordml/sdtdatahash" xmlns:w16sdtfl="http://schemas.microsoft.com/office/word/2024/wordml/sdtformatlock" xmlns:w16se="http://schemas.microsoft.com/office/word/2015/wordml/symex" xmlns:wpg="http://schemas.microsoft.com/office/word/2010/wordprocessingGroup" xmlns:wpi="http://schemas.microsoft.com/office/word/2010/wordprocessingInk" xmlns:wne="http://schemas.microsoft.com/office/word/2006/wordml" xmlns:wps="http://schemas.microsoft.com/office/word/2010/wordprocessingShape" mc:Ignorable="w14 w15 w16se w16cid w16 w16cex w16sdtdh w16sdtfl w16du wp14">
+<w15:people xmlns:wpc="http://schemas.microsoft.com/office/word/2010/wordprocessingCanvas" xmlns:cx="http://schemas.microsoft.com/office/drawing/2014/chartex" xmlns:cx1="http://schemas.microsoft.com/office/drawing/2015/9/8/chartex" xmlns:cx2="http://schemas.microsoft.com/office/drawing/2015/10/21/chartex" xmlns:cx3="http://schemas.microsoft.com/office/drawing/2016/5/9/chartex" xmlns:cx4="http://schemas.microsoft.com/office/drawing/2016/5/10/chartex" xmlns:cx5="http://schemas.microsoft.com/office/drawing/2016/5/11/chartex" xmlns:cx6="http://schemas.microsoft.com/office/drawing/2016/5/12/chartex" xmlns:cx7="http://schemas.microsoft.com/office/drawing/2016/5/13/chartex" xmlns:cx8="http://schemas.microsoft.com/office/drawing/2016/5/14/chartex" xmlns:mc="http://schemas.openxmlformats.org/markup-compatibility/2006" xmlns:aink="http://schemas.microsoft.com/office/drawing/2016/ink" xmlns:am3d="http://schemas.microsoft.com/office/drawing/2017/model3d" xmlns:o="urn:schemas-microsoft-com:office:office" xmlns:oel="http://schemas.microsoft.com/office/2019/extlst" xmlns:r="http://schemas.openxmlformats.org/officeDocument/2006/relationships" xmlns:m="http://schemas.openxmlformats.org/officeDocument/2006/math" xmlns:v="urn:schemas-microsoft-com:vml" xmlns:wp14="http://schemas.microsoft.com/office/word/2010/wordprocessingDrawing" xmlns:wp="http://schemas.openxmlformats.org/drawingml/2006/wordprocessingDrawing" xmlns:w10="urn:schemas-microsoft-com:office:word" xmlns:w="http://schemas.openxmlformats.org/wordprocessingml/2006/main" xmlns:w14="http://schemas.microsoft.com/office/word/2010/wordml" xmlns:w15="http://schemas.microsoft.com/office/word/2012/wordml" xmlns:w16cex="http://schemas.microsoft.com/office/word/2018/wordml/cex" xmlns:w16cid="http://schemas.microsoft.com/office/word/2016/wordml/cid" xmlns:w16="http://schemas.microsoft.com/office/word/2018/wordml" xmlns:w16du="http://schemas.microsoft.com/office/word/2023/wordml/word16du" xmlns:w16sdtdh="http://schemas.microsoft.com/office/word/2020/wordml/sdtdatahash" xmlns:w16sdtfl="http://schemas.microsoft.com/office/word/2024/wordml/sdtformatlock" xmlns:w16se="http://schemas.microsoft.com/office/word/2015/wordml/symex" xmlns:wpg="http://schemas.microsoft.com/office/word/2010/wordprocessingGroup" xmlns:wpi="http://schemas.microsoft.com/office/word/2010/wordprocessingInk" xmlns:wne="http://schemas.microsoft.com/office/word/2006/wordml" xmlns:wps="http://schemas.microsoft.com/office/word/2010/wordprocessingShape" mc:Ignorable="w14 w15 w16se w16cid w16 w16cex w16sdtdh w16sdtfl w16du wp14">
   <w15:person w15:author="Sebastiana Gomes">
     <w15:presenceInfo w15:providerId="Windows Live" w15:userId="4eca4e9bf25f6851"/>
   </w15:person>

</xml_diff>